<commit_message>
Final commit on TZ. Everything cheacked out and ready to stage 3(UML diagram designing)
</commit_message>
<xml_diff>
--- a/ТЗ_Инвентаризация_компьютерного_парка.docx
+++ b/ТЗ_Инвентаризация_компьютерного_парка.docx
@@ -390,6 +390,12 @@
     </w:p>
     <w:sdt>
       <w:sdtPr>
+        <w:rPr>
+          <w:rFonts w:ascii="Times New Roman" w:eastAsia="Times New Roman" w:hAnsi="Times New Roman" w:cs="Times New Roman"/>
+          <w:color w:val="auto"/>
+          <w:sz w:val="24"/>
+          <w:szCs w:val="24"/>
+        </w:rPr>
         <w:id w:val="1383438032"/>
         <w:docPartObj>
           <w:docPartGallery w:val="Table of Contents"/>
@@ -398,11 +404,7 @@
       </w:sdtPr>
       <w:sdtEndPr>
         <w:rPr>
-          <w:rFonts w:ascii="Times New Roman" w:eastAsia="Times New Roman" w:hAnsi="Times New Roman" w:cs="Times New Roman"/>
           <w:bCs/>
-          <w:color w:val="auto"/>
-          <w:sz w:val="24"/>
-          <w:szCs w:val="24"/>
         </w:rPr>
       </w:sdtEndPr>
       <w:sdtContent>
@@ -2443,21 +2445,7 @@
                 <w:rStyle w:val="a5"/>
                 <w:noProof/>
               </w:rPr>
-              <w:t>4.2 Требован</w:t>
-            </w:r>
-            <w:r>
-              <w:rPr>
-                <w:rStyle w:val="a5"/>
-                <w:noProof/>
-              </w:rPr>
-              <w:t>и</w:t>
-            </w:r>
-            <w:r>
-              <w:rPr>
-                <w:rStyle w:val="a5"/>
-                <w:noProof/>
-              </w:rPr>
-              <w:t>я к функциям (задачам), выполняемым системой</w:t>
+              <w:t>4.2 Требования к функциям (задачам), выполняемым системой</w:t>
             </w:r>
             <w:r>
               <w:rPr>
@@ -3451,21 +3439,7 @@
                 <w:rStyle w:val="a5"/>
                 <w:noProof/>
               </w:rPr>
-              <w:t>8. Требования к докум</w:t>
-            </w:r>
-            <w:r>
-              <w:rPr>
-                <w:rStyle w:val="a5"/>
-                <w:noProof/>
-              </w:rPr>
-              <w:t>е</w:t>
-            </w:r>
-            <w:r>
-              <w:rPr>
-                <w:rStyle w:val="a5"/>
-                <w:noProof/>
-              </w:rPr>
-              <w:t>нтированию.</w:t>
+              <w:t>8. Требования к документированию.</w:t>
             </w:r>
             <w:r>
               <w:rPr>
@@ -5609,15 +5583,13 @@
         <w:jc w:val="both"/>
       </w:pPr>
       <w:r>
-        <w:t xml:space="preserve">Возможно расширение функций системы: автоматическая инвентаризация оборудования по сети, печать инвентарных этикеток со </w:t>
-      </w:r>
-      <w:proofErr w:type="spellStart"/>
-      <w:r>
-        <w:t>штрихкодом</w:t>
-      </w:r>
-      <w:proofErr w:type="spellEnd"/>
-      <w:r>
-        <w:t xml:space="preserve">, экспорт отчетов в форматы </w:t>
+        <w:t>Возможно расширение функций системы: автоматическая инвентаризация оборудования по сети, печать инвентарных этикеток со штрих</w:t>
+      </w:r>
+      <w:r>
+        <w:t>-</w:t>
+      </w:r>
+      <w:r>
+        <w:t xml:space="preserve">кодом, экспорт отчетов в форматы </w:t>
       </w:r>
       <w:proofErr w:type="spellStart"/>
       <w:r>
@@ -10212,41 +10184,25 @@
             </w:tcMar>
           </w:tcPr>
           <w:p>
-            <w:pPr>
-              <w:rPr>
-                <w:color w:val="FF0000"/>
-              </w:rPr>
-            </w:pPr>
-            <w:r>
-              <w:rPr>
-                <w:color w:val="FF0000"/>
-              </w:rPr>
-              <w:t>Техническое проектирование. Анализ предметн</w:t>
-            </w:r>
-            <w:r>
-              <w:rPr>
-                <w:color w:val="FF0000"/>
-              </w:rPr>
-              <w:t>ой области. Разработка диаграмм</w:t>
-            </w:r>
-            <w:r>
-              <w:rPr>
-                <w:color w:val="FF0000"/>
-              </w:rPr>
-              <w:t xml:space="preserve"> UML. Разработка вариантов использования, примерного интерфейса «продукта». Разработка детального плана работ, распределение заданий по исполнителям.</w:t>
-            </w:r>
-          </w:p>
-          <w:p>
             <w:r>
               <w:t>Техническое проектирование. Анализ предметной облас</w:t>
             </w:r>
             <w:r>
               <w:t xml:space="preserve">ти. Разработка диаграмм </w:t>
+            </w:r>
+            <w:r>
+              <w:t>UML (</w:t>
+            </w:r>
+            <w:r>
+              <w:t>построение модели предметной области</w:t>
             </w:r>
             <w:bookmarkStart w:id="40" w:name="_GoBack"/>
             <w:bookmarkEnd w:id="40"/>
             <w:r>
-              <w:t>UML (вариантов использования, классов, последовательности, состояний, деятельности, компонентов, развёртывания). Разработка вариантов использования, примерного интерфейса «продукта». Разработка детального плана работ, распределение заданий по исполнителям.</w:t>
+              <w:t>, создание словаря данных, определение классов и их атрибутов, создание диаграммы классов, создание связей и ассоциаций, а также кратности ассоциаций с последующей группировкой классов в пакеты</w:t>
+            </w:r>
+            <w:r>
+              <w:t>). Разработка вариантов использования, примерного интерфейса «продукта». Разработка детального плана работ, распределение заданий по исполнителям.</w:t>
             </w:r>
           </w:p>
         </w:tc>
@@ -10334,6 +10290,11 @@
             </w:tcMar>
           </w:tcPr>
           <w:p>
+            <w:pPr>
+              <w:rPr>
+                <w:lang w:val="en-US"/>
+              </w:rPr>
+            </w:pPr>
             <w:r>
               <w:t>Рабочее проектирование. Создание интерфейса. Разработка бизнес-логики, базы данных.</w:t>
             </w:r>
@@ -10563,7 +10524,6 @@
         <w:jc w:val="both"/>
       </w:pPr>
       <w:r>
-        <w:lastRenderedPageBreak/>
         <w:t>провести первичную инвентаризацию компьютерного парка и подготовить исходные данные для загрузки в систему (компьютеры, комплектующие, периферийные устройства, сотрудники, отделы);</w:t>
       </w:r>
     </w:p>
@@ -10577,6 +10537,7 @@
         <w:jc w:val="both"/>
       </w:pPr>
       <w:r>
+        <w:lastRenderedPageBreak/>
         <w:t>обеспечить соответствие помещений и рабочих мест пользователей системы требованиям, изложенным в настоящем ТЗ;</w:t>
       </w:r>
     </w:p>
@@ -10782,7 +10743,7 @@
         <w:sz w:val="22"/>
         <w:szCs w:val="22"/>
       </w:rPr>
-      <w:t>12</w:t>
+      <w:t>14</w:t>
     </w:r>
     <w:r>
       <w:rPr>
@@ -12477,7 +12438,7 @@
 </file>
 
 <file path=customXml/itemProps1.xml><?xml version="1.0" encoding="utf-8"?>
-<ds:datastoreItem xmlns:ds="http://schemas.openxmlformats.org/officeDocument/2006/customXml" ds:itemID="{409394AF-D769-4E40-8081-2F42D0DD0E44}">
+<ds:datastoreItem xmlns:ds="http://schemas.openxmlformats.org/officeDocument/2006/customXml" ds:itemID="{D4906E7F-F72C-4869-A973-61E39BD7995E}">
   <ds:schemaRefs>
     <ds:schemaRef ds:uri="http://schemas.openxmlformats.org/officeDocument/2006/bibliography"/>
   </ds:schemaRefs>

</xml_diff>